<commit_message>
Atualizando Terminal Albarado: novos filtros, logotipos e módulos
</commit_message>
<xml_diff>
--- a/fundamentos e codigo de chamada e atualização.docx
+++ b/fundamentos e codigo de chamada e atualização.docx
@@ -460,18 +460,6 @@
           <w14:ligatures w14:val="none"/>
         </w:rPr>
       </w:pPr>
-    </w:p>
-    <w:p>
-      <w:pPr>
-        <w:spacing w:after="0" w:line="240" w:lineRule="auto"/>
-        <w:rPr>
-          <w:rFonts w:ascii="Calibri" w:eastAsia="Times New Roman" w:hAnsi="Calibri" w:cs="Calibri"/>
-          <w:color w:val="000000"/>
-          <w:kern w:val="0"/>
-          <w:lang w:eastAsia="pt-BR"/>
-          <w14:ligatures w14:val="none"/>
-        </w:rPr>
-      </w:pPr>
       <w:proofErr w:type="spellStart"/>
       <w:r>
         <w:rPr>
@@ -542,6 +530,121 @@
       <w:pPr>
         <w:rPr>
           <w:rFonts w:ascii="Calibri" w:eastAsia="Times New Roman" w:hAnsi="Calibri" w:cs="Calibri"/>
+          <w:b/>
+          <w:bCs/>
+          <w:color w:val="000000"/>
+          <w:kern w:val="0"/>
+          <w:lang w:eastAsia="pt-BR"/>
+          <w14:ligatures w14:val="none"/>
+        </w:rPr>
+      </w:pPr>
+      <w:r>
+        <w:rPr>
+          <w:rFonts w:ascii="Calibri" w:eastAsia="Times New Roman" w:hAnsi="Calibri" w:cs="Calibri"/>
+          <w:b/>
+          <w:bCs/>
+          <w:color w:val="000000"/>
+          <w:kern w:val="0"/>
+          <w:lang w:eastAsia="pt-BR"/>
+          <w14:ligatures w14:val="none"/>
+        </w:rPr>
+        <w:t>P/L (Preço/Lucro)</w:t>
+      </w:r>
+      <w:r>
+        <w:rPr>
+          <w:rFonts w:ascii="Calibri" w:eastAsia="Times New Roman" w:hAnsi="Calibri" w:cs="Calibri"/>
+          <w:b/>
+          <w:bCs/>
+          <w:color w:val="000000"/>
+          <w:kern w:val="0"/>
+          <w:lang w:eastAsia="pt-BR"/>
+          <w14:ligatures w14:val="none"/>
+        </w:rPr>
+        <w:t xml:space="preserve"> </w:t>
+      </w:r>
+      <w:r>
+        <w:rPr>
+          <w:rFonts w:ascii="Calibri" w:eastAsia="Times New Roman" w:hAnsi="Calibri" w:cs="Calibri"/>
+          <w:b/>
+          <w:bCs/>
+          <w:color w:val="000000"/>
+          <w:kern w:val="0"/>
+          <w:lang w:eastAsia="pt-BR"/>
+          <w14:ligatures w14:val="none"/>
+        </w:rPr>
+        <w:t>0.10 até 15.00</w:t>
+      </w:r>
+      <w:r>
+        <w:t xml:space="preserve"> </w:t>
+      </w:r>
+      <w:r>
+        <w:t>(</w:t>
+      </w:r>
+      <w:r>
+        <w:rPr>
+          <w:rFonts w:ascii="Calibri" w:eastAsia="Times New Roman" w:hAnsi="Calibri" w:cs="Calibri"/>
+          <w:color w:val="000000"/>
+          <w:kern w:val="0"/>
+          <w:lang w:eastAsia="pt-BR"/>
+          <w14:ligatures w14:val="none"/>
+        </w:rPr>
+        <w:t>ou no máximo 20.00)</w:t>
+      </w:r>
+    </w:p>
+    <w:p>
+      <w:pPr>
+        <w:rPr>
+          <w:rFonts w:ascii="Calibri" w:eastAsia="Times New Roman" w:hAnsi="Calibri" w:cs="Calibri"/>
+          <w:color w:val="000000"/>
+          <w:kern w:val="0"/>
+          <w:lang w:eastAsia="pt-BR"/>
+          <w14:ligatures w14:val="none"/>
+        </w:rPr>
+      </w:pPr>
+      <w:r>
+        <w:rPr>
+          <w:rFonts w:ascii="Calibri" w:eastAsia="Times New Roman" w:hAnsi="Calibri" w:cs="Calibri"/>
+          <w:color w:val="000000"/>
+          <w:kern w:val="0"/>
+          <w:lang w:eastAsia="pt-BR"/>
+          <w14:ligatures w14:val="none"/>
+        </w:rPr>
+        <w:t>P/VP (Preço / Valor Patrimonial)</w:t>
+      </w:r>
+      <w:r>
+        <w:rPr>
+          <w:b/>
+          <w:bCs/>
+        </w:rPr>
+        <w:t xml:space="preserve"> </w:t>
+      </w:r>
+      <w:r>
+        <w:rPr>
+          <w:rFonts w:ascii="Calibri" w:eastAsia="Times New Roman" w:hAnsi="Calibri" w:cs="Calibri"/>
+          <w:b/>
+          <w:bCs/>
+          <w:color w:val="000000"/>
+          <w:kern w:val="0"/>
+          <w:lang w:eastAsia="pt-BR"/>
+          <w14:ligatures w14:val="none"/>
+        </w:rPr>
+        <w:t>0.10 até 3.00</w:t>
+      </w:r>
+      <w:r>
+        <w:rPr>
+          <w:rFonts w:ascii="Calibri" w:eastAsia="Times New Roman" w:hAnsi="Calibri" w:cs="Calibri"/>
+          <w:color w:val="000000"/>
+          <w:kern w:val="0"/>
+          <w:lang w:eastAsia="pt-BR"/>
+          <w14:ligatures w14:val="none"/>
+        </w:rPr>
+        <w:t xml:space="preserve"> (ou no máximo 5.00)</w:t>
+      </w:r>
+    </w:p>
+    <w:p>
+      <w:pPr>
+        <w:rPr>
+          <w:rFonts w:ascii="Calibri" w:eastAsia="Times New Roman" w:hAnsi="Calibri" w:cs="Calibri"/>
           <w:color w:val="000000"/>
           <w:kern w:val="0"/>
           <w:lang w:eastAsia="pt-BR"/>
@@ -624,6 +727,50 @@
           <w14:ligatures w14:val="none"/>
         </w:rPr>
       </w:pPr>
+    </w:p>
+    <w:p>
+      <w:pPr>
+        <w:rPr>
+          <w:rFonts w:ascii="Calibri" w:eastAsia="Times New Roman" w:hAnsi="Calibri" w:cs="Calibri"/>
+          <w:color w:val="000000"/>
+          <w:kern w:val="0"/>
+          <w:lang w:eastAsia="pt-BR"/>
+          <w14:ligatures w14:val="none"/>
+        </w:rPr>
+      </w:pPr>
+      <w:proofErr w:type="spellStart"/>
+      <w:r>
+        <w:rPr>
+          <w:rFonts w:ascii="Calibri" w:eastAsia="Times New Roman" w:hAnsi="Calibri" w:cs="Calibri"/>
+          <w:color w:val="000000"/>
+          <w:kern w:val="0"/>
+          <w:lang w:eastAsia="pt-BR"/>
+          <w14:ligatures w14:val="none"/>
+        </w:rPr>
+        <w:t>cd</w:t>
+      </w:r>
+      <w:proofErr w:type="spellEnd"/>
+      <w:r>
+        <w:rPr>
+          <w:rFonts w:ascii="Calibri" w:eastAsia="Times New Roman" w:hAnsi="Calibri" w:cs="Calibri"/>
+          <w:color w:val="000000"/>
+          <w:kern w:val="0"/>
+          <w:lang w:eastAsia="pt-BR"/>
+          <w14:ligatures w14:val="none"/>
+        </w:rPr>
+        <w:t xml:space="preserve"> D:\DASHBOARD_ACOES</w:t>
+      </w:r>
+    </w:p>
+    <w:p>
+      <w:pPr>
+        <w:rPr>
+          <w:rFonts w:ascii="Calibri" w:eastAsia="Times New Roman" w:hAnsi="Calibri" w:cs="Calibri"/>
+          <w:color w:val="000000"/>
+          <w:kern w:val="0"/>
+          <w:lang w:eastAsia="pt-BR"/>
+          <w14:ligatures w14:val="none"/>
+        </w:rPr>
+      </w:pPr>
       <w:proofErr w:type="spellStart"/>
       <w:r>
         <w:rPr>
@@ -822,6 +969,1179 @@
         </w:rPr>
         <w:t xml:space="preserve"> app_b3.py</w:t>
       </w:r>
+    </w:p>
+    <w:p>
+      <w:pPr>
+        <w:rPr>
+          <w:rFonts w:ascii="Calibri" w:eastAsia="Times New Roman" w:hAnsi="Calibri" w:cs="Calibri"/>
+          <w:color w:val="000000"/>
+          <w:kern w:val="0"/>
+          <w:lang w:eastAsia="pt-BR"/>
+          <w14:ligatures w14:val="none"/>
+        </w:rPr>
+      </w:pPr>
+    </w:p>
+    <w:p>
+      <w:pPr>
+        <w:rPr>
+          <w:rFonts w:ascii="Calibri" w:eastAsia="Times New Roman" w:hAnsi="Calibri" w:cs="Calibri"/>
+          <w:color w:val="000000"/>
+          <w:kern w:val="0"/>
+          <w:highlight w:val="cyan"/>
+          <w:lang w:eastAsia="pt-BR"/>
+          <w14:ligatures w14:val="none"/>
+        </w:rPr>
+      </w:pPr>
+      <w:r>
+        <w:rPr>
+          <w:rFonts w:ascii="Calibri" w:eastAsia="Times New Roman" w:hAnsi="Calibri" w:cs="Calibri"/>
+          <w:b/>
+          <w:bCs/>
+          <w:color w:val="000000"/>
+          <w:kern w:val="0"/>
+          <w:highlight w:val="cyan"/>
+          <w:lang w:eastAsia="pt-BR"/>
+          <w14:ligatures w14:val="none"/>
+        </w:rPr>
+        <w:t xml:space="preserve">Como manter o </w:t>
+      </w:r>
+      <w:proofErr w:type="spellStart"/>
+      <w:r>
+        <w:rPr>
+          <w:rFonts w:ascii="Calibri" w:eastAsia="Times New Roman" w:hAnsi="Calibri" w:cs="Calibri"/>
+          <w:b/>
+          <w:bCs/>
+          <w:color w:val="000000"/>
+          <w:kern w:val="0"/>
+          <w:highlight w:val="cyan"/>
+          <w:lang w:eastAsia="pt-BR"/>
+          <w14:ligatures w14:val="none"/>
+        </w:rPr>
+        <w:t>Prudence</w:t>
+      </w:r>
+      <w:proofErr w:type="spellEnd"/>
+      <w:r>
+        <w:rPr>
+          <w:rFonts w:ascii="Calibri" w:eastAsia="Times New Roman" w:hAnsi="Calibri" w:cs="Calibri"/>
+          <w:b/>
+          <w:bCs/>
+          <w:color w:val="000000"/>
+          <w:kern w:val="0"/>
+          <w:highlight w:val="cyan"/>
+          <w:lang w:eastAsia="pt-BR"/>
+          <w14:ligatures w14:val="none"/>
+        </w:rPr>
+        <w:t xml:space="preserve"> </w:t>
+      </w:r>
+      <w:proofErr w:type="spellStart"/>
+      <w:r>
+        <w:rPr>
+          <w:rFonts w:ascii="Calibri" w:eastAsia="Times New Roman" w:hAnsi="Calibri" w:cs="Calibri"/>
+          <w:b/>
+          <w:bCs/>
+          <w:color w:val="000000"/>
+          <w:kern w:val="0"/>
+          <w:highlight w:val="cyan"/>
+          <w:lang w:eastAsia="pt-BR"/>
+          <w14:ligatures w14:val="none"/>
+        </w:rPr>
+        <w:t>Invest</w:t>
+      </w:r>
+      <w:proofErr w:type="spellEnd"/>
+      <w:r>
+        <w:rPr>
+          <w:rFonts w:ascii="Calibri" w:eastAsia="Times New Roman" w:hAnsi="Calibri" w:cs="Calibri"/>
+          <w:b/>
+          <w:bCs/>
+          <w:color w:val="000000"/>
+          <w:kern w:val="0"/>
+          <w:highlight w:val="cyan"/>
+          <w:lang w:eastAsia="pt-BR"/>
+          <w14:ligatures w14:val="none"/>
+        </w:rPr>
+        <w:t xml:space="preserve"> sempre atualizado:</w:t>
+      </w:r>
+      <w:r>
+        <w:rPr>
+          <w:rFonts w:ascii="Calibri" w:eastAsia="Times New Roman" w:hAnsi="Calibri" w:cs="Calibri"/>
+          <w:color w:val="000000"/>
+          <w:kern w:val="0"/>
+          <w:highlight w:val="cyan"/>
+          <w:lang w:eastAsia="pt-BR"/>
+          <w14:ligatures w14:val="none"/>
+        </w:rPr>
+        <w:t xml:space="preserve"> Como o servidor em nuvem espelha o seu GitHub, o processo para atualizar as cotações (diariamente ou semanalmente) é muito rápido. No seu terminal, basta fazer isto:</w:t>
+      </w:r>
+    </w:p>
+    <w:p>
+      <w:pPr>
+        <w:numPr>
+          <w:ilvl w:val="0"/>
+          <w:numId w:val="1"/>
+        </w:numPr>
+        <w:rPr>
+          <w:rFonts w:ascii="Calibri" w:eastAsia="Times New Roman" w:hAnsi="Calibri" w:cs="Calibri"/>
+          <w:color w:val="000000"/>
+          <w:kern w:val="0"/>
+          <w:highlight w:val="cyan"/>
+          <w:lang w:eastAsia="pt-BR"/>
+          <w14:ligatures w14:val="none"/>
+        </w:rPr>
+      </w:pPr>
+      <w:r>
+        <w:rPr>
+          <w:rFonts w:ascii="Calibri" w:eastAsia="Times New Roman" w:hAnsi="Calibri" w:cs="Calibri"/>
+          <w:color w:val="000000"/>
+          <w:kern w:val="0"/>
+          <w:highlight w:val="cyan"/>
+          <w:lang w:eastAsia="pt-BR"/>
+          <w14:ligatures w14:val="none"/>
+        </w:rPr>
+        <w:t xml:space="preserve">Rode o gerador para puxar os dados de hoje: </w:t>
+      </w:r>
+      <w:proofErr w:type="spellStart"/>
+      <w:r>
+        <w:rPr>
+          <w:rFonts w:ascii="Calibri" w:eastAsia="Times New Roman" w:hAnsi="Calibri" w:cs="Calibri"/>
+          <w:color w:val="000000"/>
+          <w:kern w:val="0"/>
+          <w:highlight w:val="cyan"/>
+          <w:lang w:eastAsia="pt-BR"/>
+          <w14:ligatures w14:val="none"/>
+        </w:rPr>
+        <w:t>python</w:t>
+      </w:r>
+      <w:proofErr w:type="spellEnd"/>
+      <w:r>
+        <w:rPr>
+          <w:rFonts w:ascii="Calibri" w:eastAsia="Times New Roman" w:hAnsi="Calibri" w:cs="Calibri"/>
+          <w:color w:val="000000"/>
+          <w:kern w:val="0"/>
+          <w:highlight w:val="cyan"/>
+          <w:lang w:eastAsia="pt-BR"/>
+          <w14:ligatures w14:val="none"/>
+        </w:rPr>
+        <w:t xml:space="preserve"> gerar_base.py</w:t>
+      </w:r>
+    </w:p>
+    <w:p>
+      <w:pPr>
+        <w:numPr>
+          <w:ilvl w:val="0"/>
+          <w:numId w:val="1"/>
+        </w:numPr>
+        <w:rPr>
+          <w:rFonts w:ascii="Calibri" w:eastAsia="Times New Roman" w:hAnsi="Calibri" w:cs="Calibri"/>
+          <w:color w:val="000000"/>
+          <w:kern w:val="0"/>
+          <w:highlight w:val="cyan"/>
+          <w:lang w:eastAsia="pt-BR"/>
+          <w14:ligatures w14:val="none"/>
+        </w:rPr>
+      </w:pPr>
+      <w:r>
+        <w:rPr>
+          <w:rFonts w:ascii="Calibri" w:eastAsia="Times New Roman" w:hAnsi="Calibri" w:cs="Calibri"/>
+          <w:color w:val="000000"/>
+          <w:kern w:val="0"/>
+          <w:highlight w:val="cyan"/>
+          <w:lang w:eastAsia="pt-BR"/>
+          <w14:ligatures w14:val="none"/>
+        </w:rPr>
+        <w:t>Envie apenas a planilha atualizada para a nuvem:</w:t>
+      </w:r>
+    </w:p>
+    <w:p>
+      <w:pPr>
+        <w:rPr>
+          <w:rFonts w:ascii="Calibri" w:eastAsia="Times New Roman" w:hAnsi="Calibri" w:cs="Calibri"/>
+          <w:color w:val="000000"/>
+          <w:kern w:val="0"/>
+          <w:highlight w:val="cyan"/>
+          <w:lang w:val="en-US" w:eastAsia="pt-BR"/>
+          <w14:ligatures w14:val="none"/>
+        </w:rPr>
+      </w:pPr>
+      <w:r>
+        <w:rPr>
+          <w:rFonts w:ascii="Calibri" w:eastAsia="Times New Roman" w:hAnsi="Calibri" w:cs="Calibri"/>
+          <w:color w:val="000000"/>
+          <w:kern w:val="0"/>
+          <w:highlight w:val="cyan"/>
+          <w:lang w:val="en-US" w:eastAsia="pt-BR"/>
+          <w14:ligatures w14:val="none"/>
+        </w:rPr>
+        <w:t>PowerShell</w:t>
+      </w:r>
+    </w:p>
+    <w:p>
+      <w:pPr>
+        <w:rPr>
+          <w:rFonts w:ascii="Calibri" w:eastAsia="Times New Roman" w:hAnsi="Calibri" w:cs="Calibri"/>
+          <w:color w:val="000000"/>
+          <w:kern w:val="0"/>
+          <w:highlight w:val="cyan"/>
+          <w:lang w:val="en-US" w:eastAsia="pt-BR"/>
+          <w14:ligatures w14:val="none"/>
+        </w:rPr>
+      </w:pPr>
+      <w:r>
+        <w:rPr>
+          <w:rFonts w:ascii="Calibri" w:eastAsia="Times New Roman" w:hAnsi="Calibri" w:cs="Calibri"/>
+          <w:color w:val="000000"/>
+          <w:kern w:val="0"/>
+          <w:highlight w:val="cyan"/>
+          <w:lang w:val="en-US" w:eastAsia="pt-BR"/>
+          <w14:ligatures w14:val="none"/>
+        </w:rPr>
+        <w:t>git add acoes_b3.xlsx</w:t>
+      </w:r>
+    </w:p>
+    <w:p>
+      <w:pPr>
+        <w:rPr>
+          <w:rFonts w:ascii="Calibri" w:eastAsia="Times New Roman" w:hAnsi="Calibri" w:cs="Calibri"/>
+          <w:color w:val="000000"/>
+          <w:kern w:val="0"/>
+          <w:highlight w:val="cyan"/>
+          <w:lang w:eastAsia="pt-BR"/>
+          <w14:ligatures w14:val="none"/>
+        </w:rPr>
+      </w:pPr>
+      <w:proofErr w:type="spellStart"/>
+      <w:r>
+        <w:rPr>
+          <w:rFonts w:ascii="Calibri" w:eastAsia="Times New Roman" w:hAnsi="Calibri" w:cs="Calibri"/>
+          <w:color w:val="000000"/>
+          <w:kern w:val="0"/>
+          <w:highlight w:val="cyan"/>
+          <w:lang w:eastAsia="pt-BR"/>
+          <w14:ligatures w14:val="none"/>
+        </w:rPr>
+        <w:t>git</w:t>
+      </w:r>
+      <w:proofErr w:type="spellEnd"/>
+      <w:r>
+        <w:rPr>
+          <w:rFonts w:ascii="Calibri" w:eastAsia="Times New Roman" w:hAnsi="Calibri" w:cs="Calibri"/>
+          <w:color w:val="000000"/>
+          <w:kern w:val="0"/>
+          <w:highlight w:val="cyan"/>
+          <w:lang w:eastAsia="pt-BR"/>
+          <w14:ligatures w14:val="none"/>
+        </w:rPr>
+        <w:t xml:space="preserve"> </w:t>
+      </w:r>
+      <w:proofErr w:type="spellStart"/>
+      <w:r>
+        <w:rPr>
+          <w:rFonts w:ascii="Calibri" w:eastAsia="Times New Roman" w:hAnsi="Calibri" w:cs="Calibri"/>
+          <w:color w:val="000000"/>
+          <w:kern w:val="0"/>
+          <w:highlight w:val="cyan"/>
+          <w:lang w:eastAsia="pt-BR"/>
+          <w14:ligatures w14:val="none"/>
+        </w:rPr>
+        <w:t>commit</w:t>
+      </w:r>
+      <w:proofErr w:type="spellEnd"/>
+      <w:r>
+        <w:rPr>
+          <w:rFonts w:ascii="Calibri" w:eastAsia="Times New Roman" w:hAnsi="Calibri" w:cs="Calibri"/>
+          <w:color w:val="000000"/>
+          <w:kern w:val="0"/>
+          <w:highlight w:val="cyan"/>
+          <w:lang w:eastAsia="pt-BR"/>
+          <w14:ligatures w14:val="none"/>
+        </w:rPr>
+        <w:t xml:space="preserve"> -m "Atualiza cotações do dia"</w:t>
+      </w:r>
+    </w:p>
+    <w:p>
+      <w:pPr>
+        <w:rPr>
+          <w:rFonts w:ascii="Calibri" w:eastAsia="Times New Roman" w:hAnsi="Calibri" w:cs="Calibri"/>
+          <w:color w:val="000000"/>
+          <w:kern w:val="0"/>
+          <w:lang w:eastAsia="pt-BR"/>
+          <w14:ligatures w14:val="none"/>
+        </w:rPr>
+      </w:pPr>
+      <w:proofErr w:type="spellStart"/>
+      <w:r>
+        <w:rPr>
+          <w:rFonts w:ascii="Calibri" w:eastAsia="Times New Roman" w:hAnsi="Calibri" w:cs="Calibri"/>
+          <w:color w:val="000000"/>
+          <w:kern w:val="0"/>
+          <w:highlight w:val="cyan"/>
+          <w:lang w:eastAsia="pt-BR"/>
+          <w14:ligatures w14:val="none"/>
+        </w:rPr>
+        <w:t>git</w:t>
+      </w:r>
+      <w:proofErr w:type="spellEnd"/>
+      <w:r>
+        <w:rPr>
+          <w:rFonts w:ascii="Calibri" w:eastAsia="Times New Roman" w:hAnsi="Calibri" w:cs="Calibri"/>
+          <w:color w:val="000000"/>
+          <w:kern w:val="0"/>
+          <w:highlight w:val="cyan"/>
+          <w:lang w:eastAsia="pt-BR"/>
+          <w14:ligatures w14:val="none"/>
+        </w:rPr>
+        <w:t xml:space="preserve"> </w:t>
+      </w:r>
+      <w:proofErr w:type="spellStart"/>
+      <w:r>
+        <w:rPr>
+          <w:rFonts w:ascii="Calibri" w:eastAsia="Times New Roman" w:hAnsi="Calibri" w:cs="Calibri"/>
+          <w:color w:val="000000"/>
+          <w:kern w:val="0"/>
+          <w:highlight w:val="cyan"/>
+          <w:lang w:eastAsia="pt-BR"/>
+          <w14:ligatures w14:val="none"/>
+        </w:rPr>
+        <w:t>push</w:t>
+      </w:r>
+      <w:proofErr w:type="spellEnd"/>
+      <w:r>
+        <w:rPr>
+          <w:rFonts w:ascii="Calibri" w:eastAsia="Times New Roman" w:hAnsi="Calibri" w:cs="Calibri"/>
+          <w:color w:val="000000"/>
+          <w:kern w:val="0"/>
+          <w:highlight w:val="cyan"/>
+          <w:lang w:eastAsia="pt-BR"/>
+          <w14:ligatures w14:val="none"/>
+        </w:rPr>
+        <w:t xml:space="preserve"> </w:t>
+      </w:r>
+      <w:proofErr w:type="spellStart"/>
+      <w:r>
+        <w:rPr>
+          <w:rFonts w:ascii="Calibri" w:eastAsia="Times New Roman" w:hAnsi="Calibri" w:cs="Calibri"/>
+          <w:color w:val="000000"/>
+          <w:kern w:val="0"/>
+          <w:highlight w:val="cyan"/>
+          <w:lang w:eastAsia="pt-BR"/>
+          <w14:ligatures w14:val="none"/>
+        </w:rPr>
+        <w:t>origin</w:t>
+      </w:r>
+      <w:proofErr w:type="spellEnd"/>
+      <w:r>
+        <w:rPr>
+          <w:rFonts w:ascii="Calibri" w:eastAsia="Times New Roman" w:hAnsi="Calibri" w:cs="Calibri"/>
+          <w:color w:val="000000"/>
+          <w:kern w:val="0"/>
+          <w:highlight w:val="cyan"/>
+          <w:lang w:eastAsia="pt-BR"/>
+          <w14:ligatures w14:val="none"/>
+        </w:rPr>
+        <w:t xml:space="preserve"> </w:t>
+      </w:r>
+      <w:proofErr w:type="spellStart"/>
+      <w:r>
+        <w:rPr>
+          <w:rFonts w:ascii="Calibri" w:eastAsia="Times New Roman" w:hAnsi="Calibri" w:cs="Calibri"/>
+          <w:color w:val="000000"/>
+          <w:kern w:val="0"/>
+          <w:highlight w:val="cyan"/>
+          <w:lang w:eastAsia="pt-BR"/>
+          <w14:ligatures w14:val="none"/>
+        </w:rPr>
+        <w:t>main</w:t>
+      </w:r>
+      <w:proofErr w:type="spellEnd"/>
+    </w:p>
+    <w:p>
+      <w:pPr>
+        <w:rPr>
+          <w:rFonts w:ascii="Calibri" w:eastAsia="Times New Roman" w:hAnsi="Calibri" w:cs="Calibri"/>
+          <w:color w:val="000000"/>
+          <w:kern w:val="0"/>
+          <w:lang w:eastAsia="pt-BR"/>
+          <w14:ligatures w14:val="none"/>
+        </w:rPr>
+      </w:pPr>
+    </w:p>
+    <w:p>
+      <w:pPr>
+        <w:rPr>
+          <w:rFonts w:ascii="Calibri" w:eastAsia="Times New Roman" w:hAnsi="Calibri" w:cs="Calibri"/>
+          <w:color w:val="000000"/>
+          <w:kern w:val="0"/>
+          <w:lang w:eastAsia="pt-BR"/>
+          <w14:ligatures w14:val="none"/>
+        </w:rPr>
+      </w:pPr>
+      <w:proofErr w:type="gramStart"/>
+      <w:r>
+        <w:rPr>
+          <w:rFonts w:ascii="Calibri" w:eastAsia="Times New Roman" w:hAnsi="Calibri" w:cs="Calibri"/>
+          <w:color w:val="000000"/>
+          <w:kern w:val="0"/>
+          <w:lang w:eastAsia="pt-BR"/>
+          <w14:ligatures w14:val="none"/>
+        </w:rPr>
+        <w:lastRenderedPageBreak/>
+        <w:t xml:space="preserve">  </w:t>
+      </w:r>
+      <w:r>
+        <w:rPr>
+          <w:rFonts w:ascii="Calibri" w:eastAsia="Times New Roman" w:hAnsi="Calibri" w:cs="Calibri"/>
+          <w:b/>
+          <w:bCs/>
+          <w:color w:val="000000"/>
+          <w:kern w:val="0"/>
+          <w:lang w:eastAsia="pt-BR"/>
+          <w14:ligatures w14:val="none"/>
+        </w:rPr>
+        <w:t>Risco</w:t>
+      </w:r>
+      <w:proofErr w:type="gramEnd"/>
+      <w:r>
+        <w:rPr>
+          <w:rFonts w:ascii="Calibri" w:eastAsia="Times New Roman" w:hAnsi="Calibri" w:cs="Calibri"/>
+          <w:b/>
+          <w:bCs/>
+          <w:color w:val="000000"/>
+          <w:kern w:val="0"/>
+          <w:lang w:eastAsia="pt-BR"/>
+          <w14:ligatures w14:val="none"/>
+        </w:rPr>
+        <w:t xml:space="preserve"> Político e de Governança = Zero:</w:t>
+      </w:r>
+      <w:r>
+        <w:rPr>
+          <w:rFonts w:ascii="Calibri" w:eastAsia="Times New Roman" w:hAnsi="Calibri" w:cs="Calibri"/>
+          <w:color w:val="000000"/>
+          <w:kern w:val="0"/>
+          <w:lang w:eastAsia="pt-BR"/>
+          <w14:ligatures w14:val="none"/>
+        </w:rPr>
+        <w:t xml:space="preserve"> Ao mesclar </w:t>
+      </w:r>
+      <w:r>
+        <w:rPr>
+          <w:rFonts w:ascii="Calibri" w:eastAsia="Times New Roman" w:hAnsi="Calibri" w:cs="Calibri"/>
+          <w:b/>
+          <w:bCs/>
+          <w:color w:val="000000"/>
+          <w:kern w:val="0"/>
+          <w:lang w:eastAsia="pt-BR"/>
+          <w14:ligatures w14:val="none"/>
+        </w:rPr>
+        <w:t>ON, Novo Mercado e Governo Majoritário (Não)</w:t>
+      </w:r>
+      <w:r>
+        <w:rPr>
+          <w:rFonts w:ascii="Calibri" w:eastAsia="Times New Roman" w:hAnsi="Calibri" w:cs="Calibri"/>
+          <w:color w:val="000000"/>
+          <w:kern w:val="0"/>
+          <w:lang w:eastAsia="pt-BR"/>
+          <w14:ligatures w14:val="none"/>
+        </w:rPr>
+        <w:t xml:space="preserve">, você filtrou as estatais (sujeitas a canetadas) e garantiu o alinhamento máximo com o acionista minoritário (100% de </w:t>
+      </w:r>
+      <w:proofErr w:type="spellStart"/>
+      <w:r>
+        <w:rPr>
+          <w:rFonts w:ascii="Calibri" w:eastAsia="Times New Roman" w:hAnsi="Calibri" w:cs="Calibri"/>
+          <w:color w:val="000000"/>
+          <w:kern w:val="0"/>
+          <w:lang w:eastAsia="pt-BR"/>
+          <w14:ligatures w14:val="none"/>
+        </w:rPr>
+        <w:t>Tag</w:t>
+      </w:r>
+      <w:proofErr w:type="spellEnd"/>
+      <w:r>
+        <w:rPr>
+          <w:rFonts w:ascii="Calibri" w:eastAsia="Times New Roman" w:hAnsi="Calibri" w:cs="Calibri"/>
+          <w:color w:val="000000"/>
+          <w:kern w:val="0"/>
+          <w:lang w:eastAsia="pt-BR"/>
+          <w14:ligatures w14:val="none"/>
+        </w:rPr>
+        <w:t xml:space="preserve"> Along).</w:t>
+      </w:r>
+    </w:p>
+    <w:p>
+      <w:pPr>
+        <w:rPr>
+          <w:rFonts w:ascii="Calibri" w:eastAsia="Times New Roman" w:hAnsi="Calibri" w:cs="Calibri"/>
+          <w:color w:val="000000"/>
+          <w:kern w:val="0"/>
+          <w:lang w:eastAsia="pt-BR"/>
+          <w14:ligatures w14:val="none"/>
+        </w:rPr>
+      </w:pPr>
+      <w:proofErr w:type="gramStart"/>
+      <w:r>
+        <w:rPr>
+          <w:rFonts w:ascii="Calibri" w:eastAsia="Times New Roman" w:hAnsi="Calibri" w:cs="Calibri"/>
+          <w:color w:val="000000"/>
+          <w:kern w:val="0"/>
+          <w:lang w:eastAsia="pt-BR"/>
+          <w14:ligatures w14:val="none"/>
+        </w:rPr>
+        <w:t xml:space="preserve">  </w:t>
+      </w:r>
+      <w:r>
+        <w:rPr>
+          <w:rFonts w:ascii="Calibri" w:eastAsia="Times New Roman" w:hAnsi="Calibri" w:cs="Calibri"/>
+          <w:b/>
+          <w:bCs/>
+          <w:color w:val="000000"/>
+          <w:kern w:val="0"/>
+          <w:lang w:eastAsia="pt-BR"/>
+          <w14:ligatures w14:val="none"/>
+        </w:rPr>
+        <w:t>Filtro</w:t>
+      </w:r>
+      <w:proofErr w:type="gramEnd"/>
+      <w:r>
+        <w:rPr>
+          <w:rFonts w:ascii="Calibri" w:eastAsia="Times New Roman" w:hAnsi="Calibri" w:cs="Calibri"/>
+          <w:b/>
+          <w:bCs/>
+          <w:color w:val="000000"/>
+          <w:kern w:val="0"/>
+          <w:lang w:eastAsia="pt-BR"/>
+          <w14:ligatures w14:val="none"/>
+        </w:rPr>
+        <w:t xml:space="preserve"> "</w:t>
+      </w:r>
+      <w:proofErr w:type="spellStart"/>
+      <w:r>
+        <w:rPr>
+          <w:rFonts w:ascii="Calibri" w:eastAsia="Times New Roman" w:hAnsi="Calibri" w:cs="Calibri"/>
+          <w:b/>
+          <w:bCs/>
+          <w:color w:val="000000"/>
+          <w:kern w:val="0"/>
+          <w:lang w:eastAsia="pt-BR"/>
+          <w14:ligatures w14:val="none"/>
+        </w:rPr>
+        <w:t>Anti-Mico</w:t>
+      </w:r>
+      <w:proofErr w:type="spellEnd"/>
+      <w:r>
+        <w:rPr>
+          <w:rFonts w:ascii="Calibri" w:eastAsia="Times New Roman" w:hAnsi="Calibri" w:cs="Calibri"/>
+          <w:b/>
+          <w:bCs/>
+          <w:color w:val="000000"/>
+          <w:kern w:val="0"/>
+          <w:lang w:eastAsia="pt-BR"/>
+          <w14:ligatures w14:val="none"/>
+        </w:rPr>
+        <w:t>" (Tamanho e Liquidez):</w:t>
+      </w:r>
+      <w:r>
+        <w:rPr>
+          <w:rFonts w:ascii="Calibri" w:eastAsia="Times New Roman" w:hAnsi="Calibri" w:cs="Calibri"/>
+          <w:color w:val="000000"/>
+          <w:kern w:val="0"/>
+          <w:lang w:eastAsia="pt-BR"/>
+          <w14:ligatures w14:val="none"/>
+        </w:rPr>
+        <w:t xml:space="preserve"> Patrimônio &gt; 1 Bilhão e Liquidez &gt; 10 Milhões limpa da tela as </w:t>
+      </w:r>
+      <w:proofErr w:type="spellStart"/>
+      <w:r>
+        <w:rPr>
+          <w:rFonts w:ascii="Calibri" w:eastAsia="Times New Roman" w:hAnsi="Calibri" w:cs="Calibri"/>
+          <w:i/>
+          <w:iCs/>
+          <w:color w:val="000000"/>
+          <w:kern w:val="0"/>
+          <w:lang w:eastAsia="pt-BR"/>
+          <w14:ligatures w14:val="none"/>
+        </w:rPr>
+        <w:t>micro-caps</w:t>
+      </w:r>
+      <w:proofErr w:type="spellEnd"/>
+      <w:r>
+        <w:rPr>
+          <w:rFonts w:ascii="Calibri" w:eastAsia="Times New Roman" w:hAnsi="Calibri" w:cs="Calibri"/>
+          <w:color w:val="000000"/>
+          <w:kern w:val="0"/>
+          <w:lang w:eastAsia="pt-BR"/>
+          <w14:ligatures w14:val="none"/>
+        </w:rPr>
+        <w:t xml:space="preserve"> obscuras, empresas em recuperação judicial ou ativos nos quais você não conseguiria vender suas ações rapidamente em um dia de pânico.</w:t>
+      </w:r>
+    </w:p>
+    <w:p>
+      <w:pPr>
+        <w:rPr>
+          <w:rFonts w:ascii="Calibri" w:eastAsia="Times New Roman" w:hAnsi="Calibri" w:cs="Calibri"/>
+          <w:color w:val="000000"/>
+          <w:kern w:val="0"/>
+          <w:lang w:eastAsia="pt-BR"/>
+          <w14:ligatures w14:val="none"/>
+        </w:rPr>
+      </w:pPr>
+      <w:proofErr w:type="gramStart"/>
+      <w:r>
+        <w:rPr>
+          <w:rFonts w:ascii="Calibri" w:eastAsia="Times New Roman" w:hAnsi="Calibri" w:cs="Calibri"/>
+          <w:color w:val="000000"/>
+          <w:kern w:val="0"/>
+          <w:lang w:eastAsia="pt-BR"/>
+          <w14:ligatures w14:val="none"/>
+        </w:rPr>
+        <w:t xml:space="preserve">  </w:t>
+      </w:r>
+      <w:r>
+        <w:rPr>
+          <w:rFonts w:ascii="Calibri" w:eastAsia="Times New Roman" w:hAnsi="Calibri" w:cs="Calibri"/>
+          <w:b/>
+          <w:bCs/>
+          <w:color w:val="000000"/>
+          <w:kern w:val="0"/>
+          <w:lang w:eastAsia="pt-BR"/>
+          <w14:ligatures w14:val="none"/>
+        </w:rPr>
+        <w:t>Filtro</w:t>
+      </w:r>
+      <w:proofErr w:type="gramEnd"/>
+      <w:r>
+        <w:rPr>
+          <w:rFonts w:ascii="Calibri" w:eastAsia="Times New Roman" w:hAnsi="Calibri" w:cs="Calibri"/>
+          <w:b/>
+          <w:bCs/>
+          <w:color w:val="000000"/>
+          <w:kern w:val="0"/>
+          <w:lang w:eastAsia="pt-BR"/>
+          <w14:ligatures w14:val="none"/>
+        </w:rPr>
+        <w:t xml:space="preserve"> "</w:t>
+      </w:r>
+      <w:proofErr w:type="spellStart"/>
+      <w:r>
+        <w:rPr>
+          <w:rFonts w:ascii="Calibri" w:eastAsia="Times New Roman" w:hAnsi="Calibri" w:cs="Calibri"/>
+          <w:b/>
+          <w:bCs/>
+          <w:color w:val="000000"/>
+          <w:kern w:val="0"/>
+          <w:lang w:eastAsia="pt-BR"/>
+          <w14:ligatures w14:val="none"/>
+        </w:rPr>
+        <w:t>Anti-Falência</w:t>
+      </w:r>
+      <w:proofErr w:type="spellEnd"/>
+      <w:r>
+        <w:rPr>
+          <w:rFonts w:ascii="Calibri" w:eastAsia="Times New Roman" w:hAnsi="Calibri" w:cs="Calibri"/>
+          <w:b/>
+          <w:bCs/>
+          <w:color w:val="000000"/>
+          <w:kern w:val="0"/>
+          <w:lang w:eastAsia="pt-BR"/>
+          <w14:ligatures w14:val="none"/>
+        </w:rPr>
+        <w:t>" (Dívida/EBIT &lt; 3):</w:t>
+      </w:r>
+      <w:r>
+        <w:rPr>
+          <w:rFonts w:ascii="Calibri" w:eastAsia="Times New Roman" w:hAnsi="Calibri" w:cs="Calibri"/>
+          <w:color w:val="000000"/>
+          <w:kern w:val="0"/>
+          <w:lang w:eastAsia="pt-BR"/>
+          <w14:ligatures w14:val="none"/>
+        </w:rPr>
+        <w:t xml:space="preserve"> No Brasil, com a Selic sempre rondando os dois dígitos, empresas muito endividadas trabalham só para pagar juros ao banco. O limite de 3x garante que a geração de caixa da empresa dá conta da dívida confortavelmente.</w:t>
+      </w:r>
+    </w:p>
+    <w:p>
+      <w:pPr>
+        <w:rPr>
+          <w:rFonts w:ascii="Calibri" w:eastAsia="Times New Roman" w:hAnsi="Calibri" w:cs="Calibri"/>
+          <w:color w:val="000000"/>
+          <w:kern w:val="0"/>
+          <w:lang w:eastAsia="pt-BR"/>
+          <w14:ligatures w14:val="none"/>
+        </w:rPr>
+      </w:pPr>
+      <w:proofErr w:type="gramStart"/>
+      <w:r>
+        <w:rPr>
+          <w:rFonts w:ascii="Calibri" w:eastAsia="Times New Roman" w:hAnsi="Calibri" w:cs="Calibri"/>
+          <w:color w:val="000000"/>
+          <w:kern w:val="0"/>
+          <w:lang w:eastAsia="pt-BR"/>
+          <w14:ligatures w14:val="none"/>
+        </w:rPr>
+        <w:t xml:space="preserve">  </w:t>
+      </w:r>
+      <w:r>
+        <w:rPr>
+          <w:rFonts w:ascii="Calibri" w:eastAsia="Times New Roman" w:hAnsi="Calibri" w:cs="Calibri"/>
+          <w:b/>
+          <w:bCs/>
+          <w:color w:val="000000"/>
+          <w:kern w:val="0"/>
+          <w:lang w:eastAsia="pt-BR"/>
+          <w14:ligatures w14:val="none"/>
+        </w:rPr>
+        <w:t>A</w:t>
+      </w:r>
+      <w:proofErr w:type="gramEnd"/>
+      <w:r>
+        <w:rPr>
+          <w:rFonts w:ascii="Calibri" w:eastAsia="Times New Roman" w:hAnsi="Calibri" w:cs="Calibri"/>
+          <w:b/>
+          <w:bCs/>
+          <w:color w:val="000000"/>
+          <w:kern w:val="0"/>
+          <w:lang w:eastAsia="pt-BR"/>
+          <w14:ligatures w14:val="none"/>
+        </w:rPr>
+        <w:t xml:space="preserve"> "Sacada de Mestre" (</w:t>
+      </w:r>
+      <w:proofErr w:type="spellStart"/>
+      <w:r>
+        <w:rPr>
+          <w:rFonts w:ascii="Calibri" w:eastAsia="Times New Roman" w:hAnsi="Calibri" w:cs="Calibri"/>
+          <w:b/>
+          <w:bCs/>
+          <w:color w:val="000000"/>
+          <w:kern w:val="0"/>
+          <w:lang w:eastAsia="pt-BR"/>
+          <w14:ligatures w14:val="none"/>
+        </w:rPr>
+        <w:t>Chowder</w:t>
+      </w:r>
+      <w:proofErr w:type="spellEnd"/>
+      <w:r>
+        <w:rPr>
+          <w:rFonts w:ascii="Calibri" w:eastAsia="Times New Roman" w:hAnsi="Calibri" w:cs="Calibri"/>
+          <w:b/>
+          <w:bCs/>
+          <w:color w:val="000000"/>
+          <w:kern w:val="0"/>
+          <w:lang w:eastAsia="pt-BR"/>
+          <w14:ligatures w14:val="none"/>
+        </w:rPr>
+        <w:t xml:space="preserve"> Rule):</w:t>
+      </w:r>
+      <w:r>
+        <w:rPr>
+          <w:rFonts w:ascii="Calibri" w:eastAsia="Times New Roman" w:hAnsi="Calibri" w:cs="Calibri"/>
+          <w:color w:val="000000"/>
+          <w:kern w:val="0"/>
+          <w:lang w:eastAsia="pt-BR"/>
+          <w14:ligatures w14:val="none"/>
+        </w:rPr>
+        <w:t xml:space="preserve"> Deixar o </w:t>
+      </w:r>
+      <w:proofErr w:type="spellStart"/>
+      <w:r>
+        <w:rPr>
+          <w:rFonts w:ascii="Calibri" w:eastAsia="Times New Roman" w:hAnsi="Calibri" w:cs="Calibri"/>
+          <w:color w:val="000000"/>
+          <w:kern w:val="0"/>
+          <w:lang w:eastAsia="pt-BR"/>
+          <w14:ligatures w14:val="none"/>
+        </w:rPr>
+        <w:t>Dividend</w:t>
+      </w:r>
+      <w:proofErr w:type="spellEnd"/>
+      <w:r>
+        <w:rPr>
+          <w:rFonts w:ascii="Calibri" w:eastAsia="Times New Roman" w:hAnsi="Calibri" w:cs="Calibri"/>
+          <w:color w:val="000000"/>
+          <w:kern w:val="0"/>
+          <w:lang w:eastAsia="pt-BR"/>
+          <w14:ligatures w14:val="none"/>
+        </w:rPr>
+        <w:t xml:space="preserve"> </w:t>
+      </w:r>
+      <w:proofErr w:type="spellStart"/>
+      <w:r>
+        <w:rPr>
+          <w:rFonts w:ascii="Calibri" w:eastAsia="Times New Roman" w:hAnsi="Calibri" w:cs="Calibri"/>
+          <w:color w:val="000000"/>
+          <w:kern w:val="0"/>
+          <w:lang w:eastAsia="pt-BR"/>
+          <w14:ligatures w14:val="none"/>
+        </w:rPr>
+        <w:t>Yield</w:t>
+      </w:r>
+      <w:proofErr w:type="spellEnd"/>
+      <w:r>
+        <w:rPr>
+          <w:rFonts w:ascii="Calibri" w:eastAsia="Times New Roman" w:hAnsi="Calibri" w:cs="Calibri"/>
+          <w:color w:val="000000"/>
+          <w:kern w:val="0"/>
+          <w:lang w:eastAsia="pt-BR"/>
+          <w14:ligatures w14:val="none"/>
+        </w:rPr>
+        <w:t xml:space="preserve"> e o Crescimento isolados abertos, mas exigir </w:t>
+      </w:r>
+      <w:r>
+        <w:rPr>
+          <w:rFonts w:ascii="Calibri" w:eastAsia="Times New Roman" w:hAnsi="Calibri" w:cs="Calibri"/>
+          <w:b/>
+          <w:bCs/>
+          <w:color w:val="000000"/>
+          <w:kern w:val="0"/>
+          <w:lang w:eastAsia="pt-BR"/>
+          <w14:ligatures w14:val="none"/>
+        </w:rPr>
+        <w:t xml:space="preserve">15% na Soma </w:t>
+      </w:r>
+      <w:proofErr w:type="spellStart"/>
+      <w:r>
+        <w:rPr>
+          <w:rFonts w:ascii="Calibri" w:eastAsia="Times New Roman" w:hAnsi="Calibri" w:cs="Calibri"/>
+          <w:b/>
+          <w:bCs/>
+          <w:color w:val="000000"/>
+          <w:kern w:val="0"/>
+          <w:lang w:eastAsia="pt-BR"/>
+          <w14:ligatures w14:val="none"/>
+        </w:rPr>
+        <w:t>Yield</w:t>
+      </w:r>
+      <w:proofErr w:type="spellEnd"/>
+      <w:r>
+        <w:rPr>
+          <w:rFonts w:ascii="Calibri" w:eastAsia="Times New Roman" w:hAnsi="Calibri" w:cs="Calibri"/>
+          <w:b/>
+          <w:bCs/>
+          <w:color w:val="000000"/>
+          <w:kern w:val="0"/>
+          <w:lang w:eastAsia="pt-BR"/>
+          <w14:ligatures w14:val="none"/>
+        </w:rPr>
+        <w:t xml:space="preserve"> + CAGR</w:t>
+      </w:r>
+      <w:r>
+        <w:rPr>
+          <w:rFonts w:ascii="Calibri" w:eastAsia="Times New Roman" w:hAnsi="Calibri" w:cs="Calibri"/>
+          <w:color w:val="000000"/>
+          <w:kern w:val="0"/>
+          <w:lang w:eastAsia="pt-BR"/>
+          <w14:ligatures w14:val="none"/>
+        </w:rPr>
+        <w:t xml:space="preserve"> foi uma jogada inteligentíssima. Isso permite que o sistema te mostre tanto uma "Vaca Leiteira" (que cresce </w:t>
+      </w:r>
+      <w:proofErr w:type="gramStart"/>
+      <w:r>
+        <w:rPr>
+          <w:rFonts w:ascii="Calibri" w:eastAsia="Times New Roman" w:hAnsi="Calibri" w:cs="Calibri"/>
+          <w:color w:val="000000"/>
+          <w:kern w:val="0"/>
+          <w:lang w:eastAsia="pt-BR"/>
+          <w14:ligatures w14:val="none"/>
+        </w:rPr>
+        <w:t>0%</w:t>
+      </w:r>
+      <w:proofErr w:type="gramEnd"/>
+      <w:r>
+        <w:rPr>
+          <w:rFonts w:ascii="Calibri" w:eastAsia="Times New Roman" w:hAnsi="Calibri" w:cs="Calibri"/>
+          <w:color w:val="000000"/>
+          <w:kern w:val="0"/>
+          <w:lang w:eastAsia="pt-BR"/>
+          <w14:ligatures w14:val="none"/>
+        </w:rPr>
+        <w:t xml:space="preserve"> mas paga 15% de </w:t>
+      </w:r>
+      <w:proofErr w:type="spellStart"/>
+      <w:r>
+        <w:rPr>
+          <w:rFonts w:ascii="Calibri" w:eastAsia="Times New Roman" w:hAnsi="Calibri" w:cs="Calibri"/>
+          <w:color w:val="000000"/>
+          <w:kern w:val="0"/>
+          <w:lang w:eastAsia="pt-BR"/>
+          <w14:ligatures w14:val="none"/>
+        </w:rPr>
+        <w:t>yield</w:t>
+      </w:r>
+      <w:proofErr w:type="spellEnd"/>
+      <w:r>
+        <w:rPr>
+          <w:rFonts w:ascii="Calibri" w:eastAsia="Times New Roman" w:hAnsi="Calibri" w:cs="Calibri"/>
+          <w:color w:val="000000"/>
+          <w:kern w:val="0"/>
+          <w:lang w:eastAsia="pt-BR"/>
+          <w14:ligatures w14:val="none"/>
+        </w:rPr>
+        <w:t xml:space="preserve">) quanto uma "Empresa de Crescimento" (que paga 0% de </w:t>
+      </w:r>
+      <w:proofErr w:type="spellStart"/>
+      <w:r>
+        <w:rPr>
+          <w:rFonts w:ascii="Calibri" w:eastAsia="Times New Roman" w:hAnsi="Calibri" w:cs="Calibri"/>
+          <w:color w:val="000000"/>
+          <w:kern w:val="0"/>
+          <w:lang w:eastAsia="pt-BR"/>
+          <w14:ligatures w14:val="none"/>
+        </w:rPr>
+        <w:t>yield</w:t>
+      </w:r>
+      <w:proofErr w:type="spellEnd"/>
+      <w:r>
+        <w:rPr>
+          <w:rFonts w:ascii="Calibri" w:eastAsia="Times New Roman" w:hAnsi="Calibri" w:cs="Calibri"/>
+          <w:color w:val="000000"/>
+          <w:kern w:val="0"/>
+          <w:lang w:eastAsia="pt-BR"/>
+          <w14:ligatures w14:val="none"/>
+        </w:rPr>
+        <w:t>, mas cresce 15% ao ano), não te limitando a um único estilo de investimento.</w:t>
+      </w:r>
+    </w:p>
+    <w:p>
+      <w:pPr>
+        <w:rPr>
+          <w:rFonts w:ascii="Calibri" w:eastAsia="Times New Roman" w:hAnsi="Calibri" w:cs="Calibri"/>
+          <w:color w:val="000000"/>
+          <w:kern w:val="0"/>
+          <w:lang w:eastAsia="pt-BR"/>
+          <w14:ligatures w14:val="none"/>
+        </w:rPr>
+      </w:pPr>
+    </w:p>
+    <w:p>
+      <w:pPr>
+        <w:rPr>
+          <w:rFonts w:ascii="Calibri" w:eastAsia="Times New Roman" w:hAnsi="Calibri" w:cs="Calibri"/>
+          <w:color w:val="000000"/>
+          <w:kern w:val="0"/>
+          <w:highlight w:val="red"/>
+          <w:lang w:eastAsia="pt-BR"/>
+          <w14:ligatures w14:val="none"/>
+        </w:rPr>
+      </w:pPr>
+      <w:r>
+        <w:rPr>
+          <w:rFonts w:ascii="Calibri" w:eastAsia="Times New Roman" w:hAnsi="Calibri" w:cs="Calibri"/>
+          <w:color w:val="000000"/>
+          <w:kern w:val="0"/>
+          <w:highlight w:val="red"/>
+          <w:lang w:eastAsia="pt-BR"/>
+          <w14:ligatures w14:val="none"/>
+        </w:rPr>
+        <w:t>Se você notar no futuro que uma ação do setor perene está classificada incorretamente (</w:t>
+      </w:r>
+      <w:proofErr w:type="spellStart"/>
+      <w:r>
+        <w:rPr>
+          <w:rFonts w:ascii="Calibri" w:eastAsia="Times New Roman" w:hAnsi="Calibri" w:cs="Calibri"/>
+          <w:color w:val="000000"/>
+          <w:kern w:val="0"/>
+          <w:highlight w:val="red"/>
+          <w:lang w:eastAsia="pt-BR"/>
+          <w14:ligatures w14:val="none"/>
+        </w:rPr>
+        <w:t>ex</w:t>
+      </w:r>
+      <w:proofErr w:type="spellEnd"/>
+      <w:r>
+        <w:rPr>
+          <w:rFonts w:ascii="Calibri" w:eastAsia="Times New Roman" w:hAnsi="Calibri" w:cs="Calibri"/>
+          <w:color w:val="000000"/>
+          <w:kern w:val="0"/>
+          <w:highlight w:val="red"/>
+          <w:lang w:eastAsia="pt-BR"/>
+          <w14:ligatures w14:val="none"/>
+        </w:rPr>
+        <w:t>: apareceu como "Financeiro" em vez de "Bancos", ou "Utilidade Pública" em vez de "Energia Elétrica"), o processo é simples:</w:t>
+      </w:r>
+    </w:p>
+    <w:p>
+      <w:pPr>
+        <w:numPr>
+          <w:ilvl w:val="0"/>
+          <w:numId w:val="2"/>
+        </w:numPr>
+        <w:rPr>
+          <w:rFonts w:ascii="Calibri" w:eastAsia="Times New Roman" w:hAnsi="Calibri" w:cs="Calibri"/>
+          <w:color w:val="000000"/>
+          <w:kern w:val="0"/>
+          <w:highlight w:val="red"/>
+          <w:lang w:eastAsia="pt-BR"/>
+          <w14:ligatures w14:val="none"/>
+        </w:rPr>
+      </w:pPr>
+      <w:r>
+        <w:rPr>
+          <w:rFonts w:ascii="Calibri" w:eastAsia="Times New Roman" w:hAnsi="Calibri" w:cs="Calibri"/>
+          <w:color w:val="000000"/>
+          <w:kern w:val="0"/>
+          <w:highlight w:val="red"/>
+          <w:lang w:eastAsia="pt-BR"/>
+          <w14:ligatures w14:val="none"/>
+        </w:rPr>
+        <w:t>Abra o arquivo gerar_base.py.</w:t>
+      </w:r>
+    </w:p>
+    <w:p>
+      <w:pPr>
+        <w:numPr>
+          <w:ilvl w:val="0"/>
+          <w:numId w:val="2"/>
+        </w:numPr>
+        <w:rPr>
+          <w:rFonts w:ascii="Calibri" w:eastAsia="Times New Roman" w:hAnsi="Calibri" w:cs="Calibri"/>
+          <w:color w:val="000000"/>
+          <w:kern w:val="0"/>
+          <w:highlight w:val="red"/>
+          <w:lang w:eastAsia="pt-BR"/>
+          <w14:ligatures w14:val="none"/>
+        </w:rPr>
+      </w:pPr>
+      <w:r>
+        <w:rPr>
+          <w:rFonts w:ascii="Calibri" w:eastAsia="Times New Roman" w:hAnsi="Calibri" w:cs="Calibri"/>
+          <w:color w:val="000000"/>
+          <w:kern w:val="0"/>
+          <w:highlight w:val="red"/>
+          <w:lang w:eastAsia="pt-BR"/>
+          <w14:ligatures w14:val="none"/>
+        </w:rPr>
+        <w:t xml:space="preserve">Adicione as 4 letras do </w:t>
+      </w:r>
+      <w:proofErr w:type="spellStart"/>
+      <w:r>
+        <w:rPr>
+          <w:rFonts w:ascii="Calibri" w:eastAsia="Times New Roman" w:hAnsi="Calibri" w:cs="Calibri"/>
+          <w:color w:val="000000"/>
+          <w:kern w:val="0"/>
+          <w:highlight w:val="red"/>
+          <w:lang w:eastAsia="pt-BR"/>
+          <w14:ligatures w14:val="none"/>
+        </w:rPr>
+        <w:t>ticker</w:t>
+      </w:r>
+      <w:proofErr w:type="spellEnd"/>
+      <w:r>
+        <w:rPr>
+          <w:rFonts w:ascii="Calibri" w:eastAsia="Times New Roman" w:hAnsi="Calibri" w:cs="Calibri"/>
+          <w:color w:val="000000"/>
+          <w:kern w:val="0"/>
+          <w:highlight w:val="red"/>
+          <w:lang w:eastAsia="pt-BR"/>
+          <w14:ligatures w14:val="none"/>
+        </w:rPr>
+        <w:t xml:space="preserve"> da ação na lista correspondente dentro do SETORES_PERENES (assim como fizemos com a "EQPA").</w:t>
+      </w:r>
+    </w:p>
+    <w:p>
+      <w:pPr>
+        <w:numPr>
+          <w:ilvl w:val="0"/>
+          <w:numId w:val="2"/>
+        </w:numPr>
+        <w:rPr>
+          <w:rFonts w:ascii="Calibri" w:eastAsia="Times New Roman" w:hAnsi="Calibri" w:cs="Calibri"/>
+          <w:color w:val="000000"/>
+          <w:kern w:val="0"/>
+          <w:highlight w:val="red"/>
+          <w:lang w:eastAsia="pt-BR"/>
+          <w14:ligatures w14:val="none"/>
+        </w:rPr>
+      </w:pPr>
+      <w:r>
+        <w:rPr>
+          <w:rFonts w:ascii="Calibri" w:eastAsia="Times New Roman" w:hAnsi="Calibri" w:cs="Calibri"/>
+          <w:color w:val="000000"/>
+          <w:kern w:val="0"/>
+          <w:highlight w:val="red"/>
+          <w:lang w:eastAsia="pt-BR"/>
+          <w14:ligatures w14:val="none"/>
+        </w:rPr>
+        <w:t>Salve, gere a base novamente (</w:t>
+      </w:r>
+      <w:proofErr w:type="spellStart"/>
+      <w:r>
+        <w:rPr>
+          <w:rFonts w:ascii="Calibri" w:eastAsia="Times New Roman" w:hAnsi="Calibri" w:cs="Calibri"/>
+          <w:color w:val="000000"/>
+          <w:kern w:val="0"/>
+          <w:highlight w:val="red"/>
+          <w:lang w:eastAsia="pt-BR"/>
+          <w14:ligatures w14:val="none"/>
+        </w:rPr>
+        <w:t>python</w:t>
+      </w:r>
+      <w:proofErr w:type="spellEnd"/>
+      <w:r>
+        <w:rPr>
+          <w:rFonts w:ascii="Calibri" w:eastAsia="Times New Roman" w:hAnsi="Calibri" w:cs="Calibri"/>
+          <w:color w:val="000000"/>
+          <w:kern w:val="0"/>
+          <w:highlight w:val="red"/>
+          <w:lang w:eastAsia="pt-BR"/>
+          <w14:ligatures w14:val="none"/>
+        </w:rPr>
+        <w:t xml:space="preserve"> gerar_base.py) e faça o </w:t>
+      </w:r>
+      <w:proofErr w:type="spellStart"/>
+      <w:r>
+        <w:rPr>
+          <w:rFonts w:ascii="Calibri" w:eastAsia="Times New Roman" w:hAnsi="Calibri" w:cs="Calibri"/>
+          <w:color w:val="000000"/>
+          <w:kern w:val="0"/>
+          <w:highlight w:val="red"/>
+          <w:lang w:eastAsia="pt-BR"/>
+          <w14:ligatures w14:val="none"/>
+        </w:rPr>
+        <w:t>commit</w:t>
+      </w:r>
+      <w:proofErr w:type="spellEnd"/>
+      <w:r>
+        <w:rPr>
+          <w:rFonts w:ascii="Calibri" w:eastAsia="Times New Roman" w:hAnsi="Calibri" w:cs="Calibri"/>
+          <w:color w:val="000000"/>
+          <w:kern w:val="0"/>
+          <w:highlight w:val="red"/>
+          <w:lang w:eastAsia="pt-BR"/>
+          <w14:ligatures w14:val="none"/>
+        </w:rPr>
+        <w:t>/</w:t>
+      </w:r>
+      <w:proofErr w:type="spellStart"/>
+      <w:r>
+        <w:rPr>
+          <w:rFonts w:ascii="Calibri" w:eastAsia="Times New Roman" w:hAnsi="Calibri" w:cs="Calibri"/>
+          <w:color w:val="000000"/>
+          <w:kern w:val="0"/>
+          <w:highlight w:val="red"/>
+          <w:lang w:eastAsia="pt-BR"/>
+          <w14:ligatures w14:val="none"/>
+        </w:rPr>
+        <w:t>push</w:t>
+      </w:r>
+      <w:proofErr w:type="spellEnd"/>
+      <w:r>
+        <w:rPr>
+          <w:rFonts w:ascii="Calibri" w:eastAsia="Times New Roman" w:hAnsi="Calibri" w:cs="Calibri"/>
+          <w:color w:val="000000"/>
+          <w:kern w:val="0"/>
+          <w:highlight w:val="red"/>
+          <w:lang w:eastAsia="pt-BR"/>
+          <w14:ligatures w14:val="none"/>
+        </w:rPr>
+        <w:t xml:space="preserve"> para o GitHub.</w:t>
+      </w:r>
+    </w:p>
+    <w:p>
+      <w:pPr>
+        <w:rPr>
+          <w:rFonts w:ascii="Calibri" w:eastAsia="Times New Roman" w:hAnsi="Calibri" w:cs="Calibri"/>
+          <w:color w:val="000000"/>
+          <w:kern w:val="0"/>
+          <w:lang w:eastAsia="pt-BR"/>
+          <w14:ligatures w14:val="none"/>
+        </w:rPr>
+      </w:pPr>
     </w:p>
     <w:sectPr>
       <w:pgSz w:w="11906" w:h="16838"/>
@@ -831,6 +2151,243 @@
     </w:sectPr>
   </w:body>
 </w:document>
+</file>
+
+<file path=word/numbering.xml><?xml version="1.0" encoding="utf-8"?>
+<w:numbering xmlns:wpc="http://schemas.microsoft.com/office/word/2010/wordprocessingCanvas" xmlns:cx="http://schemas.microsoft.com/office/drawing/2014/chartex" xmlns:cx1="http://schemas.microsoft.com/office/drawing/2015/9/8/chartex" xmlns:cx2="http://schemas.microsoft.com/office/drawing/2015/10/21/chartex" xmlns:cx3="http://schemas.microsoft.com/office/drawing/2016/5/9/chartex" xmlns:cx4="http://schemas.microsoft.com/office/drawing/2016/5/10/chartex" xmlns:cx5="http://schemas.microsoft.com/office/drawing/2016/5/11/chartex" xmlns:cx6="http://schemas.microsoft.com/office/drawing/2016/5/12/chartex" xmlns:cx7="http://schemas.microsoft.com/office/drawing/2016/5/13/chartex" xmlns:cx8="http://schemas.microsoft.com/office/drawing/2016/5/14/chartex" xmlns:mc="http://schemas.openxmlformats.org/markup-compatibility/2006" xmlns:aink="http://schemas.microsoft.com/office/drawing/2016/ink" xmlns:am3d="http://schemas.microsoft.com/office/drawing/2017/model3d" xmlns:o="urn:schemas-microsoft-com:office:office" xmlns:oel="http://schemas.microsoft.com/office/2019/extlst" xmlns:r="http://schemas.openxmlformats.org/officeDocument/2006/relationships" xmlns:m="http://schemas.openxmlformats.org/officeDocument/2006/math" xmlns:v="urn:schemas-microsoft-com:vml" xmlns:wp14="http://schemas.microsoft.com/office/word/2010/wordprocessingDrawing" xmlns:wp="http://schemas.openxmlformats.org/drawingml/2006/wordprocessingDrawing" xmlns:w10="urn:schemas-microsoft-com:office:word" xmlns:w="http://schemas.openxmlformats.org/wordprocessingml/2006/main" xmlns:w14="http://schemas.microsoft.com/office/word/2010/wordml" xmlns:w15="http://schemas.microsoft.com/office/word/2012/wordml" xmlns:w16cex="http://schemas.microsoft.com/office/word/2018/wordml/cex" xmlns:w16cid="http://schemas.microsoft.com/office/word/2016/wordml/cid" xmlns:w16="http://schemas.microsoft.com/office/word/2018/wordml" xmlns:w16du="http://schemas.microsoft.com/office/word/2023/wordml/word16du" xmlns:w16sdtdh="http://schemas.microsoft.com/office/word/2020/wordml/sdtdatahash" xmlns:w16sdtfl="http://schemas.microsoft.com/office/word/2024/wordml/sdtformatlock" xmlns:w16se="http://schemas.microsoft.com/office/word/2015/wordml/symex" xmlns:wpg="http://schemas.microsoft.com/office/word/2010/wordprocessingGroup" xmlns:wpi="http://schemas.microsoft.com/office/word/2010/wordprocessingInk" xmlns:wne="http://schemas.microsoft.com/office/word/2006/wordml" xmlns:wps="http://schemas.microsoft.com/office/word/2010/wordprocessingShape" mc:Ignorable="w14 w15 w16se w16cid w16 w16cex w16sdtdh w16sdtfl w16du wp14">
+  <w:abstractNum w:abstractNumId="0" w15:restartNumberingAfterBreak="0">
+    <w:nsid w:val="5C4920C0"/>
+    <w:multiLevelType w:val="multilevel"/>
+    <w:tmpl w:val="32C05AC0"/>
+    <w:lvl w:ilvl="0">
+      <w:start w:val="1"/>
+      <w:numFmt w:val="decimal"/>
+      <w:lvlText w:val="%1."/>
+      <w:lvlJc w:val="left"/>
+      <w:pPr>
+        <w:tabs>
+          <w:tab w:val="num" w:pos="720"/>
+        </w:tabs>
+        <w:ind w:left="720" w:hanging="360"/>
+      </w:pPr>
+    </w:lvl>
+    <w:lvl w:ilvl="1" w:tentative="1">
+      <w:start w:val="1"/>
+      <w:numFmt w:val="decimal"/>
+      <w:lvlText w:val="%2."/>
+      <w:lvlJc w:val="left"/>
+      <w:pPr>
+        <w:tabs>
+          <w:tab w:val="num" w:pos="1440"/>
+        </w:tabs>
+        <w:ind w:left="1440" w:hanging="360"/>
+      </w:pPr>
+    </w:lvl>
+    <w:lvl w:ilvl="2" w:tentative="1">
+      <w:start w:val="1"/>
+      <w:numFmt w:val="decimal"/>
+      <w:lvlText w:val="%3."/>
+      <w:lvlJc w:val="left"/>
+      <w:pPr>
+        <w:tabs>
+          <w:tab w:val="num" w:pos="2160"/>
+        </w:tabs>
+        <w:ind w:left="2160" w:hanging="360"/>
+      </w:pPr>
+    </w:lvl>
+    <w:lvl w:ilvl="3" w:tentative="1">
+      <w:start w:val="1"/>
+      <w:numFmt w:val="decimal"/>
+      <w:lvlText w:val="%4."/>
+      <w:lvlJc w:val="left"/>
+      <w:pPr>
+        <w:tabs>
+          <w:tab w:val="num" w:pos="2880"/>
+        </w:tabs>
+        <w:ind w:left="2880" w:hanging="360"/>
+      </w:pPr>
+    </w:lvl>
+    <w:lvl w:ilvl="4" w:tentative="1">
+      <w:start w:val="1"/>
+      <w:numFmt w:val="decimal"/>
+      <w:lvlText w:val="%5."/>
+      <w:lvlJc w:val="left"/>
+      <w:pPr>
+        <w:tabs>
+          <w:tab w:val="num" w:pos="3600"/>
+        </w:tabs>
+        <w:ind w:left="3600" w:hanging="360"/>
+      </w:pPr>
+    </w:lvl>
+    <w:lvl w:ilvl="5" w:tentative="1">
+      <w:start w:val="1"/>
+      <w:numFmt w:val="decimal"/>
+      <w:lvlText w:val="%6."/>
+      <w:lvlJc w:val="left"/>
+      <w:pPr>
+        <w:tabs>
+          <w:tab w:val="num" w:pos="4320"/>
+        </w:tabs>
+        <w:ind w:left="4320" w:hanging="360"/>
+      </w:pPr>
+    </w:lvl>
+    <w:lvl w:ilvl="6" w:tentative="1">
+      <w:start w:val="1"/>
+      <w:numFmt w:val="decimal"/>
+      <w:lvlText w:val="%7."/>
+      <w:lvlJc w:val="left"/>
+      <w:pPr>
+        <w:tabs>
+          <w:tab w:val="num" w:pos="5040"/>
+        </w:tabs>
+        <w:ind w:left="5040" w:hanging="360"/>
+      </w:pPr>
+    </w:lvl>
+    <w:lvl w:ilvl="7" w:tentative="1">
+      <w:start w:val="1"/>
+      <w:numFmt w:val="decimal"/>
+      <w:lvlText w:val="%8."/>
+      <w:lvlJc w:val="left"/>
+      <w:pPr>
+        <w:tabs>
+          <w:tab w:val="num" w:pos="5760"/>
+        </w:tabs>
+        <w:ind w:left="5760" w:hanging="360"/>
+      </w:pPr>
+    </w:lvl>
+    <w:lvl w:ilvl="8" w:tentative="1">
+      <w:start w:val="1"/>
+      <w:numFmt w:val="decimal"/>
+      <w:lvlText w:val="%9."/>
+      <w:lvlJc w:val="left"/>
+      <w:pPr>
+        <w:tabs>
+          <w:tab w:val="num" w:pos="6480"/>
+        </w:tabs>
+        <w:ind w:left="6480" w:hanging="360"/>
+      </w:pPr>
+    </w:lvl>
+  </w:abstractNum>
+  <w:abstractNum w:abstractNumId="1" w15:restartNumberingAfterBreak="0">
+    <w:nsid w:val="5FBD1D02"/>
+    <w:multiLevelType w:val="multilevel"/>
+    <w:tmpl w:val="3344133A"/>
+    <w:lvl w:ilvl="0">
+      <w:start w:val="1"/>
+      <w:numFmt w:val="decimal"/>
+      <w:lvlText w:val="%1."/>
+      <w:lvlJc w:val="left"/>
+      <w:pPr>
+        <w:tabs>
+          <w:tab w:val="num" w:pos="720"/>
+        </w:tabs>
+        <w:ind w:left="720" w:hanging="360"/>
+      </w:pPr>
+    </w:lvl>
+    <w:lvl w:ilvl="1" w:tentative="1">
+      <w:start w:val="1"/>
+      <w:numFmt w:val="decimal"/>
+      <w:lvlText w:val="%2."/>
+      <w:lvlJc w:val="left"/>
+      <w:pPr>
+        <w:tabs>
+          <w:tab w:val="num" w:pos="1440"/>
+        </w:tabs>
+        <w:ind w:left="1440" w:hanging="360"/>
+      </w:pPr>
+    </w:lvl>
+    <w:lvl w:ilvl="2" w:tentative="1">
+      <w:start w:val="1"/>
+      <w:numFmt w:val="decimal"/>
+      <w:lvlText w:val="%3."/>
+      <w:lvlJc w:val="left"/>
+      <w:pPr>
+        <w:tabs>
+          <w:tab w:val="num" w:pos="2160"/>
+        </w:tabs>
+        <w:ind w:left="2160" w:hanging="360"/>
+      </w:pPr>
+    </w:lvl>
+    <w:lvl w:ilvl="3" w:tentative="1">
+      <w:start w:val="1"/>
+      <w:numFmt w:val="decimal"/>
+      <w:lvlText w:val="%4."/>
+      <w:lvlJc w:val="left"/>
+      <w:pPr>
+        <w:tabs>
+          <w:tab w:val="num" w:pos="2880"/>
+        </w:tabs>
+        <w:ind w:left="2880" w:hanging="360"/>
+      </w:pPr>
+    </w:lvl>
+    <w:lvl w:ilvl="4" w:tentative="1">
+      <w:start w:val="1"/>
+      <w:numFmt w:val="decimal"/>
+      <w:lvlText w:val="%5."/>
+      <w:lvlJc w:val="left"/>
+      <w:pPr>
+        <w:tabs>
+          <w:tab w:val="num" w:pos="3600"/>
+        </w:tabs>
+        <w:ind w:left="3600" w:hanging="360"/>
+      </w:pPr>
+    </w:lvl>
+    <w:lvl w:ilvl="5" w:tentative="1">
+      <w:start w:val="1"/>
+      <w:numFmt w:val="decimal"/>
+      <w:lvlText w:val="%6."/>
+      <w:lvlJc w:val="left"/>
+      <w:pPr>
+        <w:tabs>
+          <w:tab w:val="num" w:pos="4320"/>
+        </w:tabs>
+        <w:ind w:left="4320" w:hanging="360"/>
+      </w:pPr>
+    </w:lvl>
+    <w:lvl w:ilvl="6" w:tentative="1">
+      <w:start w:val="1"/>
+      <w:numFmt w:val="decimal"/>
+      <w:lvlText w:val="%7."/>
+      <w:lvlJc w:val="left"/>
+      <w:pPr>
+        <w:tabs>
+          <w:tab w:val="num" w:pos="5040"/>
+        </w:tabs>
+        <w:ind w:left="5040" w:hanging="360"/>
+      </w:pPr>
+    </w:lvl>
+    <w:lvl w:ilvl="7" w:tentative="1">
+      <w:start w:val="1"/>
+      <w:numFmt w:val="decimal"/>
+      <w:lvlText w:val="%8."/>
+      <w:lvlJc w:val="left"/>
+      <w:pPr>
+        <w:tabs>
+          <w:tab w:val="num" w:pos="5760"/>
+        </w:tabs>
+        <w:ind w:left="5760" w:hanging="360"/>
+      </w:pPr>
+    </w:lvl>
+    <w:lvl w:ilvl="8" w:tentative="1">
+      <w:start w:val="1"/>
+      <w:numFmt w:val="decimal"/>
+      <w:lvlText w:val="%9."/>
+      <w:lvlJc w:val="left"/>
+      <w:pPr>
+        <w:tabs>
+          <w:tab w:val="num" w:pos="6480"/>
+        </w:tabs>
+        <w:ind w:left="6480" w:hanging="360"/>
+      </w:pPr>
+    </w:lvl>
+  </w:abstractNum>
+  <w:num w:numId="1" w16cid:durableId="2060861026">
+    <w:abstractNumId w:val="0"/>
+  </w:num>
+  <w:num w:numId="2" w16cid:durableId="39592706">
+    <w:abstractNumId w:val="1"/>
+  </w:num>
+</w:numbering>
 </file>
 
 <file path=word/styles.xml><?xml version="1.0" encoding="utf-8"?>
@@ -1436,7 +2993,6 @@
   <w:style w:type="character" w:default="1" w:styleId="Fontepargpadro">
     <w:name w:val="Default Paragraph Font"/>
     <w:uiPriority w:val="1"/>
-    <w:semiHidden/>
     <w:unhideWhenUsed/>
   </w:style>
   <w:style w:type="table" w:default="1" w:styleId="Tabelanormal">

</xml_diff>